<commit_message>
docs: update companion guide and changelog for repo structure fix
- Companion Guide v2.1: updated Getting Started checklist steps 1-2
  to reflect harness files already at repo root (no copy step needed)
- Harness changelog: added entry documenting the file relocation and
  .gitignore update

Co-Authored-By: Claude Opus 4.6 <noreply@anthropic.com>
</commit_message>
<xml_diff>
--- a/Reel48+ Harness Companion Guide.docx
+++ b/Reel48+ Harness Companion Guide.docx
@@ -110,7 +110,7 @@
           <w:sz w:val="22"/>
           <w:szCs w:val="22"/>
         </w:rPr>
-        <w:t xml:space="preserve">April 2026 | v2.0 — Includes Harness Maintenance Protocol</w:t>
+        <w:t>April 2026 | v2.1 — Includes Harness Maintenance Protocol + Repo Structure Fix</w:t>
       </w:r>
     </w:p>
     <w:p>
@@ -5610,7 +5610,7 @@
           <w:sz w:val="22"/>
           <w:szCs w:val="22"/>
         </w:rPr>
-        <w:t xml:space="preserve">Create your GitHub monorepo with /frontend and /backend directories.</w:t>
+        <w:t>Verify the GitHub repository (Reel48/Reel48-Enterprise-Platform) contains the harness files at the repo root with /frontend and /backend directories.</w:t>
       </w:r>
     </w:p>
     <w:p>
@@ -5628,7 +5628,7 @@
           <w:sz w:val="22"/>
           <w:szCs w:val="22"/>
         </w:rPr>
-        <w:t xml:space="preserve">Copy the entire harness file structure into the repository root.</w:t>
+        <w:t>Verify all harness files are at the repo root (CLAUDE.md, .claude/rules/, frontend/CLAUDE.md, backend/CLAUDE.md, docs/, prompts/). These must not be nested under a subdirectory.</w:t>
       </w:r>
     </w:p>
     <w:p>

</xml_diff>

<commit_message>
feat: add Stripe invoicing & client billing to harness
Invoicing was entirely missing from the harness. Added:
- Stripe to tech stack, invoicing conventions, and invoice lifecycle
  to root CLAUDE.md
- Module 7 (Invoicing & Client Billing) to build order (now 9 modules)
- Invoice models, routes, services, and tests to backend CLAUDE.md
- Invoice pages and components to frontend CLAUDE.md
- Invoice permissions to auth role-based access matrix
- New rule file: .claude/rules/stripe-invoicing.md
- New ADR: docs/adr/006-stripe-for-invoicing.md
- Updated companion guide (v2.2) and harness changelog

Co-Authored-By: Claude Opus 4.6 <noreply@anthropic.com>
</commit_message>
<xml_diff>
--- a/Reel48+ Harness Companion Guide.docx
+++ b/Reel48+ Harness Companion Guide.docx
@@ -110,7 +110,7 @@
           <w:sz w:val="22"/>
           <w:szCs w:val="22"/>
         </w:rPr>
-        <w:t>April 2026 | v2.1 — Includes Harness Maintenance Protocol + Repo Structure Fix</w:t>
+        <w:t>April 2026 | v2.2 — Includes Harness Maintenance Protocol + Stripe Invoicing</w:t>
       </w:r>
     </w:p>
     <w:p>
@@ -1881,6 +1881,38 @@
           </w:p>
         </w:tc>
       </w:tr>
+      <w:tr>
+        <w:tc>
+          <w:tcPr>
+            <w:tcW w:type="dxa" w:w="3000"/>
+          </w:tcPr>
+          <w:p>
+            <w:r>
+              <w:t>stripe-invoicing.md</w:t>
+            </w:r>
+          </w:p>
+        </w:tc>
+        <w:tc>
+          <w:tcPr>
+            <w:tcW w:type="dxa" w:w="2500"/>
+          </w:tcPr>
+          <w:p>
+            <w:r>
+              <w:t>**/invoice*, **/billing*, **/stripe*, **/webhook*</w:t>
+            </w:r>
+          </w:p>
+        </w:tc>
+        <w:tc>
+          <w:tcPr>
+            <w:tcW w:type="dxa" w:w="3860"/>
+          </w:tcPr>
+          <w:p>
+            <w:r>
+              <w:t>Stripe integration, invoice lifecycle, webhook security, tenant-scoped billing</w:t>
+            </w:r>
+          </w:p>
+        </w:tc>
+      </w:tr>
     </w:tbl>
     <w:p>
       <w:pPr>
@@ -2350,6 +2382,28 @@
           </w:p>
         </w:tc>
       </w:tr>
+      <w:tr>
+        <w:tc>
+          <w:tcPr>
+            <w:tcW w:type="dxa" w:w="3200"/>
+          </w:tcPr>
+          <w:p>
+            <w:r>
+              <w:t>006: Stripe for Invoicing</w:t>
+            </w:r>
+          </w:p>
+        </w:tc>
+        <w:tc>
+          <w:tcPr>
+            <w:tcW w:type="dxa" w:w="6160"/>
+          </w:tcPr>
+          <w:p>
+            <w:r>
+              <w:t>Stripe as the invoicing platform over custom billing or QuickBooks/Xero.</w:t>
+            </w:r>
+          </w:p>
+        </w:tc>
+      </w:tr>
     </w:tbl>
     <w:p>
       <w:pPr>
@@ -3767,6 +3821,50 @@
           </w:p>
         </w:tc>
       </w:tr>
+      <w:tr>
+        <w:tc>
+          <w:tcPr>
+            <w:tcW w:type="dxa" w:w="3200"/>
+          </w:tcPr>
+          <w:p>
+            <w:r>
+              <w:t>.claude/rules/stripe-invoicing.md</w:t>
+            </w:r>
+          </w:p>
+        </w:tc>
+        <w:tc>
+          <w:tcPr>
+            <w:tcW w:type="dxa" w:w="6160"/>
+          </w:tcPr>
+          <w:p>
+            <w:r>
+              <w:t>Rule: Stripe integration, invoice lifecycle, webhook security, billing patterns.</w:t>
+            </w:r>
+          </w:p>
+        </w:tc>
+      </w:tr>
+      <w:tr>
+        <w:tc>
+          <w:tcPr>
+            <w:tcW w:type="dxa" w:w="3200"/>
+          </w:tcPr>
+          <w:p>
+            <w:r>
+              <w:t>docs/adr/006-stripe-for-invoicing.md</w:t>
+            </w:r>
+          </w:p>
+        </w:tc>
+        <w:tc>
+          <w:tcPr>
+            <w:tcW w:type="dxa" w:w="6160"/>
+          </w:tcPr>
+          <w:p>
+            <w:r>
+              <w:t>ADR: Stripe over custom invoicing or QuickBooks/Xero.</w:t>
+            </w:r>
+          </w:p>
+        </w:tc>
+      </w:tr>
     </w:tbl>
     <w:p>
       <w:pPr>
@@ -5557,7 +5655,7 @@
           <w:sz w:val="22"/>
           <w:szCs w:val="22"/>
         </w:rPr>
-        <w:t xml:space="preserve">Total: 22 files forming the complete, self-maintaining development harness for Reel48+.</w:t>
+        <w:t>Total: 24 files forming the complete, self-maintaining development harness for Reel48+.</w:t>
       </w:r>
     </w:p>
     <w:p>

</xml_diff>

<commit_message>
feat: add reel48_admin role and revise billing model to three flows
Adds the reel48_admin platform operator role with cross-company access
and RLS bypass. Restructures invoicing so only reel48_admin creates
invoices for client companies. Introduces three billing flows: assigned
(bulk/custom), self-service (pre-priced catalog), and post-window
(consolidated after buying window closes). Updates all harness files
including role hierarchy, access matrix, TenantContext, Stripe rule,
companion guide (v2.3), and changelog.

Co-Authored-By: Claude Opus 4.6 <noreply@anthropic.com>
</commit_message>
<xml_diff>
--- a/Reel48+ Harness Companion Guide.docx
+++ b/Reel48+ Harness Companion Guide.docx
@@ -110,7 +110,7 @@
           <w:sz w:val="22"/>
           <w:szCs w:val="22"/>
         </w:rPr>
-        <w:t>April 2026 | v2.2 — Includes Harness Maintenance Protocol + Stripe Invoicing</w:t>
+        <w:t>April 2026 | v2.3 — Includes Harness Maintenance Protocol + Stripe Invoicing + Reel48 Admin Role</w:t>
       </w:r>
     </w:p>
     <w:p>
@@ -812,7 +812,7 @@
           <w:sz w:val="22"/>
           <w:szCs w:val="22"/>
         </w:rPr>
-        <w:t xml:space="preserve">The most critical section. Defines the dual-dimension isolation model, RLS policy pattern, role hierarchy, and default sub-brand rule.</w:t>
+        <w:t xml:space="preserve">The most critical section. Defines the dual-dimension isolation model, RLS policy pattern, five-role hierarchy (reel48_admin, corporate_admin, sub_brand_admin, regional_manager, employee), RLS bypass for the platform admin, and default sub-brand rule.</w:t>
       </w:r>
     </w:p>
     <w:p>
@@ -1600,7 +1600,7 @@
                 <w:sz w:val="20"/>
                 <w:szCs w:val="20"/>
               </w:rPr>
-              <w:t xml:space="preserve">Cognito, JWT validation, invite flow, role hierarchy</w:t>
+              <w:t xml:space="preserve">Cognito, JWT validation, invite flow, five-role hierarchy with reel48_admin</w:t>
             </w:r>
           </w:p>
         </w:tc>
@@ -1908,7 +1908,7 @@
           </w:tcPr>
           <w:p>
             <w:r>
-              <w:t>Stripe integration, invoice lifecycle, webhook security, tenant-scoped billing</w:t>
+              <w:t>Stripe integration, three billing flows (assigned, self-service, post-window), reel48_admin invoice creation, webhook security, tenant-scoped billing</w:t>
             </w:r>
           </w:p>
         </w:tc>
@@ -3838,7 +3838,7 @@
           </w:tcPr>
           <w:p>
             <w:r>
-              <w:t>Rule: Stripe integration, invoice lifecycle, webhook security, billing patterns.</w:t>
+              <w:t>Rule: Stripe integration, three billing flows, reel48_admin invoice creation, webhook security, billing patterns.</w:t>
             </w:r>
           </w:p>
         </w:tc>
@@ -4944,7 +4944,7 @@
                 <w:sz w:val="20"/>
                 <w:szCs w:val="20"/>
               </w:rPr>
-              <w:t xml:space="preserve">Rule: Cognito, JWT validation, invite flow, role hierarchy.</w:t>
+              <w:t xml:space="preserve">Rule: Cognito, JWT validation, invite flow, five-role hierarchy with reel48_admin.</w:t>
             </w:r>
           </w:p>
         </w:tc>

</xml_diff>

<commit_message>
docs: update companion guide to v2.4 with self-registration coverage
Adds ADR-007 (controlled self-registration), self-registration.md prompt
template, and stripe-invoicing.md rule to all inventory sections. Updates
authentication and testing rule descriptions, file count (24 → 27), and
ADR range (001–005 → 001–007).

Co-Authored-By: Claude Opus 4.6 <noreply@anthropic.com>
</commit_message>
<xml_diff>
--- a/Reel48+ Harness Companion Guide.docx
+++ b/Reel48+ Harness Companion Guide.docx
@@ -110,7 +110,7 @@
           <w:sz w:val="22"/>
           <w:szCs w:val="22"/>
         </w:rPr>
-        <w:t>April 2026 | v2.3 — Includes Harness Maintenance Protocol + Stripe Invoicing + Reel48 Admin Role</w:t>
+        <w:t>April 2026 | v2.4 — Includes Harness Maintenance Protocol + Stripe Invoicing + Reel48 Admin Role + Self-Registration via Org Code</w:t>
       </w:r>
     </w:p>
     <w:p>
@@ -972,6 +972,34 @@
           <w:sz w:val="22"/>
           <w:szCs w:val="22"/>
         </w:rPr>
+        <w:t xml:space="preserve">Employee Onboarding Paths: </w:t>
+      </w:r>
+      <w:r>
+        <w:rPr>
+          <w:rFonts w:ascii="Arial" w:cs="Arial" w:eastAsia="Arial" w:hAnsi="Arial"/>
+          <w:sz w:val="22"/>
+          <w:szCs w:val="22"/>
+        </w:rPr>
+        <w:t xml:space="preserve">Two onboarding flows — admin invite (targeted) and self-registration via org code (bulk). Both guarantee valid tenant context from user creation.</w:t>
+      </w:r>
+    </w:p>
+    <w:p>
+      <w:pPr>
+        <w:pStyle w:val="ListParagraph"/>
+        <w:numPr>
+          <w:ilvl w:val="0"/>
+          <w:numId w:val="2"/>
+        </w:numPr>
+        <w:spacing w:after="80"/>
+      </w:pPr>
+      <w:r>
+        <w:rPr>
+          <w:rFonts w:ascii="Arial" w:cs="Arial" w:eastAsia="Arial" w:hAnsi="Arial"/>
+          <w:b/>
+          <w:bCs/>
+          <w:sz w:val="22"/>
+          <w:szCs w:val="22"/>
+        </w:rPr>
         <w:t xml:space="preserve">Harness Maintenance Protocol: </w:t>
       </w:r>
       <w:r>
@@ -1600,7 +1628,7 @@
                 <w:sz w:val="20"/>
                 <w:szCs w:val="20"/>
               </w:rPr>
-              <w:t xml:space="preserve">Cognito, JWT validation, invite flow, five-role hierarchy with reel48_admin</w:t>
+              <w:t xml:space="preserve">Cognito, JWT validation, invite flow, self-registration via org code, org code management, five-role hierarchy with reel48_admin</w:t>
             </w:r>
           </w:p>
         </w:tc>
@@ -1692,7 +1720,7 @@
                 <w:sz w:val="20"/>
                 <w:szCs w:val="20"/>
               </w:rPr>
-              <w:t xml:space="preserve">Three test categories, factories, coverage targets</w:t>
+              <w:t xml:space="preserve">Three test categories, factories, coverage targets, self-registration security tests</w:t>
             </w:r>
           </w:p>
         </w:tc>
@@ -2404,6 +2432,28 @@
           </w:p>
         </w:tc>
       </w:tr>
+      <w:tr>
+        <w:tc>
+          <w:tcPr>
+            <w:tcW w:type="dxa" w:w="3200"/>
+          </w:tcPr>
+          <w:p>
+            <w:r>
+              <w:t>007: Controlled Self-Registration</w:t>
+            </w:r>
+          </w:p>
+        </w:tc>
+        <w:tc>
+          <w:tcPr>
+            <w:tcW w:type="dxa" w:w="6160"/>
+          </w:tcPr>
+          <w:p>
+            <w:r>
+              <w:t>Org-code-based self-registration alongside admin invites for bulk employee onboarding.</w:t>
+            </w:r>
+          </w:p>
+        </w:tc>
+      </w:tr>
     </w:tbl>
     <w:p>
       <w:pPr>
@@ -2873,6 +2923,68 @@
           </w:p>
         </w:tc>
       </w:tr>
+      <w:tr>
+        <w:tc>
+          <w:tcPr>
+            <w:tcW w:type="dxa" w:w="3200"/>
+            <w:tcBorders>
+              <w:top w:val="single" w:color="CCCCCC" w:sz="1"/>
+              <w:left w:val="single" w:color="CCCCCC" w:sz="1"/>
+              <w:bottom w:val="single" w:color="CCCCCC" w:sz="1"/>
+              <w:right w:val="single" w:color="CCCCCC" w:sz="1"/>
+            </w:tcBorders>
+            <w:tcMar>
+              <w:top w:type="dxa" w:w="80"/>
+              <w:left w:type="dxa" w:w="120"/>
+              <w:bottom w:type="dxa" w:w="80"/>
+              <w:right w:type="dxa" w:w="120"/>
+            </w:tcMar>
+          </w:tcPr>
+          <w:p>
+            <w:r>
+              <w:rPr>
+                <w:rFonts w:ascii="Arial" w:cs="Arial" w:eastAsia="Arial" w:hAnsi="Arial"/>
+                <w:b w:val="false"/>
+                <w:bCs w:val="false"/>
+                <w:color w:val="333333"/>
+                <w:sz w:val="20"/>
+                <w:szCs w:val="20"/>
+              </w:rPr>
+              <w:t xml:space="preserve">self-registration.md</w:t>
+            </w:r>
+          </w:p>
+        </w:tc>
+        <w:tc>
+          <w:tcPr>
+            <w:tcW w:type="dxa" w:w="6160"/>
+            <w:tcBorders>
+              <w:top w:val="single" w:color="CCCCCC" w:sz="1"/>
+              <w:left w:val="single" w:color="CCCCCC" w:sz="1"/>
+              <w:bottom w:val="single" w:color="CCCCCC" w:sz="1"/>
+              <w:right w:val="single" w:color="CCCCCC" w:sz="1"/>
+            </w:tcBorders>
+            <w:tcMar>
+              <w:top w:type="dxa" w:w="80"/>
+              <w:left w:type="dxa" w:w="120"/>
+              <w:bottom w:type="dxa" w:w="80"/>
+              <w:right w:type="dxa" w:w="120"/>
+            </w:tcMar>
+          </w:tcPr>
+          <w:p>
+            <w:r>
+              <w:rPr>
+                <w:rFonts w:ascii="Arial" w:cs="Arial" w:eastAsia="Arial" w:hAnsi="Arial"/>
+                <w:b w:val="false"/>
+                <w:bCs w:val="false"/>
+                <w:color w:val="333333"/>
+                <w:sz w:val="20"/>
+                <w:szCs w:val="20"/>
+              </w:rPr>
+              <w:t xml:space="preserve">Building the self-registration flow: org code validation, registration endpoint, rate limiting, and security tests.</w:t>
+            </w:r>
+          </w:p>
+        </w:tc>
+      </w:tr>
     </w:tbl>
     <w:p>
       <w:pPr>
@@ -2897,7 +3009,7 @@
           <w:sz w:val="22"/>
           <w:szCs w:val="22"/>
         </w:rPr>
-        <w:t xml:space="preserve">Note the new harness-review.md template. This is used after completing each module (Modules 1–8) to run the deep review described in the maintenance protocol.</w:t>
+        <w:t xml:space="preserve">Note the new harness-review.md and self-registration.md templates. The harness-review template is used after completing each module (Modules 1–8) to run the deep review described in the maintenance protocol. The self-registration template covers the org-code-based onboarding flow added in ADR-007.</w:t>
       </w:r>
     </w:p>
     <w:p>
@@ -3865,6 +3977,50 @@
           </w:p>
         </w:tc>
       </w:tr>
+      <w:tr>
+        <w:tc>
+          <w:tcPr>
+            <w:tcW w:type="dxa" w:w="3200"/>
+          </w:tcPr>
+          <w:p>
+            <w:r>
+              <w:t>docs/adr/007-controlled-self-registration.md</w:t>
+            </w:r>
+          </w:p>
+        </w:tc>
+        <w:tc>
+          <w:tcPr>
+            <w:tcW w:type="dxa" w:w="6160"/>
+          </w:tcPr>
+          <w:p>
+            <w:r>
+              <w:t>ADR: Org-code self-registration alongside admin invites (ADR-007).</w:t>
+            </w:r>
+          </w:p>
+        </w:tc>
+      </w:tr>
+      <w:tr>
+        <w:tc>
+          <w:tcPr>
+            <w:tcW w:type="dxa" w:w="3200"/>
+          </w:tcPr>
+          <w:p>
+            <w:r>
+              <w:t>prompts/self-registration.md</w:t>
+            </w:r>
+          </w:p>
+        </w:tc>
+        <w:tc>
+          <w:tcPr>
+            <w:tcW w:type="dxa" w:w="6160"/>
+          </w:tcPr>
+          <w:p>
+            <w:r>
+              <w:t>Template: self-registration flow with org code validation, rate limiting, and security tests.</w:t>
+            </w:r>
+          </w:p>
+        </w:tc>
+      </w:tr>
     </w:tbl>
     <w:p>
       <w:pPr>
@@ -4944,7 +5100,7 @@
                 <w:sz w:val="20"/>
                 <w:szCs w:val="20"/>
               </w:rPr>
-              <w:t xml:space="preserve">Rule: Cognito, JWT validation, invite flow, five-role hierarchy with reel48_admin.</w:t>
+              <w:t xml:space="preserve">Rule: Cognito, JWT validation, invite flow, self-registration via org code, org code management, five-role hierarchy with reel48_admin.</w:t>
             </w:r>
           </w:p>
         </w:tc>
@@ -5162,7 +5318,7 @@
                 <w:sz w:val="20"/>
                 <w:szCs w:val="20"/>
               </w:rPr>
-              <w:t xml:space="preserve">docs/adr/TEMPLATE.md</w:t>
+              <w:t xml:space="preserve">.claude/rules/stripe-invoicing.md</w:t>
             </w:r>
           </w:p>
         </w:tc>
@@ -5192,7 +5348,7 @@
                 <w:sz w:val="20"/>
                 <w:szCs w:val="20"/>
               </w:rPr>
-              <w:t xml:space="preserve">Template for new Architectural Decision Records.</w:t>
+              <w:t xml:space="preserve">Rule: Stripe integration, three billing flows, reel48_admin invoice creation, webhook security.</w:t>
             </w:r>
           </w:p>
         </w:tc>
@@ -5224,7 +5380,7 @@
                 <w:sz w:val="20"/>
                 <w:szCs w:val="20"/>
               </w:rPr>
-              <w:t xml:space="preserve">docs/adr/001 through 005</w:t>
+              <w:t xml:space="preserve">docs/adr/TEMPLATE.md</w:t>
             </w:r>
           </w:p>
         </w:tc>
@@ -5254,7 +5410,7 @@
                 <w:sz w:val="20"/>
                 <w:szCs w:val="20"/>
               </w:rPr>
-              <w:t xml:space="preserve">Five ADRs covering multi-tenancy, RLS, default sub-brand, REST, and Cognito.</w:t>
+              <w:t xml:space="preserve">Template for new Architectural Decision Records.</w:t>
             </w:r>
           </w:p>
         </w:tc>
@@ -5286,7 +5442,7 @@
                 <w:sz w:val="20"/>
                 <w:szCs w:val="20"/>
               </w:rPr>
-              <w:t xml:space="preserve">docs/harness-changelog.md</w:t>
+              <w:t xml:space="preserve">docs/adr/001 through 007</w:t>
             </w:r>
           </w:p>
         </w:tc>
@@ -5316,7 +5472,7 @@
                 <w:sz w:val="20"/>
                 <w:szCs w:val="20"/>
               </w:rPr>
-              <w:t xml:space="preserve">Chronological log of every harness change with metrics tracking.</w:t>
+              <w:t xml:space="preserve">Seven ADRs covering multi-tenancy, RLS, default sub-brand, REST, Cognito, Stripe invoicing, and self-registration.</w:t>
             </w:r>
           </w:p>
         </w:tc>
@@ -5348,7 +5504,7 @@
                 <w:sz w:val="20"/>
                 <w:szCs w:val="20"/>
               </w:rPr>
-              <w:t xml:space="preserve">prompts/crud-endpoint.md</w:t>
+              <w:t xml:space="preserve">docs/harness-changelog.md</w:t>
             </w:r>
           </w:p>
         </w:tc>
@@ -5378,7 +5534,7 @@
                 <w:sz w:val="20"/>
                 <w:szCs w:val="20"/>
               </w:rPr>
-              <w:t xml:space="preserve">Template: complete CRUD APIs with tenant isolation.</w:t>
+              <w:t xml:space="preserve">Chronological log of every harness change with metrics tracking.</w:t>
             </w:r>
           </w:p>
         </w:tc>
@@ -5410,7 +5566,7 @@
                 <w:sz w:val="20"/>
                 <w:szCs w:val="20"/>
               </w:rPr>
-              <w:t xml:space="preserve">prompts/new-table-migration.md</w:t>
+              <w:t xml:space="preserve">prompts/crud-endpoint.md</w:t>
             </w:r>
           </w:p>
         </w:tc>
@@ -5440,7 +5596,7 @@
                 <w:sz w:val="20"/>
                 <w:szCs w:val="20"/>
               </w:rPr>
-              <w:t xml:space="preserve">Template: database tables with RLS.</w:t>
+              <w:t xml:space="preserve">Template: complete CRUD APIs with tenant isolation.</w:t>
             </w:r>
           </w:p>
         </w:tc>
@@ -5472,7 +5628,7 @@
                 <w:sz w:val="20"/>
                 <w:szCs w:val="20"/>
               </w:rPr>
-              <w:t xml:space="preserve">prompts/react-component.md</w:t>
+              <w:t xml:space="preserve">prompts/new-table-migration.md</w:t>
             </w:r>
           </w:p>
         </w:tc>
@@ -5502,7 +5658,7 @@
                 <w:sz w:val="20"/>
                 <w:szCs w:val="20"/>
               </w:rPr>
-              <w:t xml:space="preserve">Template: React components with proper patterns.</w:t>
+              <w:t xml:space="preserve">Template: database tables with RLS.</w:t>
             </w:r>
           </w:p>
         </w:tc>
@@ -5534,7 +5690,7 @@
                 <w:sz w:val="20"/>
                 <w:szCs w:val="20"/>
               </w:rPr>
-              <w:t xml:space="preserve">prompts/test-suite.md</w:t>
+              <w:t xml:space="preserve">prompts/react-component.md</w:t>
             </w:r>
           </w:p>
         </w:tc>
@@ -5564,7 +5720,7 @@
                 <w:sz w:val="20"/>
                 <w:szCs w:val="20"/>
               </w:rPr>
-              <w:t xml:space="preserve">Template: comprehensive test suites with isolation tests.</w:t>
+              <w:t xml:space="preserve">Template: React components with proper patterns.</w:t>
             </w:r>
           </w:p>
         </w:tc>
@@ -5596,6 +5752,68 @@
                 <w:sz w:val="20"/>
                 <w:szCs w:val="20"/>
               </w:rPr>
+              <w:t xml:space="preserve">prompts/test-suite.md</w:t>
+            </w:r>
+          </w:p>
+        </w:tc>
+        <w:tc>
+          <w:tcPr>
+            <w:tcW w:type="dxa" w:w="6160"/>
+            <w:tcBorders>
+              <w:top w:val="single" w:color="CCCCCC" w:sz="1"/>
+              <w:left w:val="single" w:color="CCCCCC" w:sz="1"/>
+              <w:bottom w:val="single" w:color="CCCCCC" w:sz="1"/>
+              <w:right w:val="single" w:color="CCCCCC" w:sz="1"/>
+            </w:tcBorders>
+            <w:tcMar>
+              <w:top w:type="dxa" w:w="80"/>
+              <w:left w:type="dxa" w:w="120"/>
+              <w:bottom w:type="dxa" w:w="80"/>
+              <w:right w:type="dxa" w:w="120"/>
+            </w:tcMar>
+          </w:tcPr>
+          <w:p>
+            <w:r>
+              <w:rPr>
+                <w:rFonts w:ascii="Arial" w:cs="Arial" w:eastAsia="Arial" w:hAnsi="Arial"/>
+                <w:b w:val="false"/>
+                <w:bCs w:val="false"/>
+                <w:color w:val="333333"/>
+                <w:sz w:val="20"/>
+                <w:szCs w:val="20"/>
+              </w:rPr>
+              <w:t xml:space="preserve">Template: comprehensive test suites with isolation tests.</w:t>
+            </w:r>
+          </w:p>
+        </w:tc>
+      </w:tr>
+      <w:tr>
+        <w:tc>
+          <w:tcPr>
+            <w:tcW w:type="dxa" w:w="3200"/>
+            <w:tcBorders>
+              <w:top w:val="single" w:color="CCCCCC" w:sz="1"/>
+              <w:left w:val="single" w:color="CCCCCC" w:sz="1"/>
+              <w:bottom w:val="single" w:color="CCCCCC" w:sz="1"/>
+              <w:right w:val="single" w:color="CCCCCC" w:sz="1"/>
+            </w:tcBorders>
+            <w:tcMar>
+              <w:top w:type="dxa" w:w="80"/>
+              <w:left w:type="dxa" w:w="120"/>
+              <w:bottom w:type="dxa" w:w="80"/>
+              <w:right w:type="dxa" w:w="120"/>
+            </w:tcMar>
+          </w:tcPr>
+          <w:p>
+            <w:r>
+              <w:rPr>
+                <w:rFonts w:ascii="Arial" w:cs="Arial" w:eastAsia="Arial" w:hAnsi="Arial"/>
+                <w:b w:val="false"/>
+                <w:bCs w:val="false"/>
+                <w:color w:val="333333"/>
+                <w:sz w:val="20"/>
+                <w:szCs w:val="20"/>
+              </w:rPr>
               <w:t xml:space="preserve">prompts/harness-review.md</w:t>
             </w:r>
           </w:p>
@@ -5627,6 +5845,68 @@
                 <w:szCs w:val="20"/>
               </w:rPr>
               <w:t xml:space="preserve">Template: post-module harness review process.</w:t>
+            </w:r>
+          </w:p>
+        </w:tc>
+      </w:tr>
+      <w:tr>
+        <w:tc>
+          <w:tcPr>
+            <w:tcW w:type="dxa" w:w="3200"/>
+            <w:tcBorders>
+              <w:top w:val="single" w:color="CCCCCC" w:sz="1"/>
+              <w:left w:val="single" w:color="CCCCCC" w:sz="1"/>
+              <w:bottom w:val="single" w:color="CCCCCC" w:sz="1"/>
+              <w:right w:val="single" w:color="CCCCCC" w:sz="1"/>
+            </w:tcBorders>
+            <w:tcMar>
+              <w:top w:type="dxa" w:w="80"/>
+              <w:left w:type="dxa" w:w="120"/>
+              <w:bottom w:type="dxa" w:w="80"/>
+              <w:right w:type="dxa" w:w="120"/>
+            </w:tcMar>
+          </w:tcPr>
+          <w:p>
+            <w:r>
+              <w:rPr>
+                <w:rFonts w:ascii="Arial" w:cs="Arial" w:eastAsia="Arial" w:hAnsi="Arial"/>
+                <w:b w:val="false"/>
+                <w:bCs w:val="false"/>
+                <w:color w:val="333333"/>
+                <w:sz w:val="20"/>
+                <w:szCs w:val="20"/>
+              </w:rPr>
+              <w:t xml:space="preserve">prompts/self-registration.md</w:t>
+            </w:r>
+          </w:p>
+        </w:tc>
+        <w:tc>
+          <w:tcPr>
+            <w:tcW w:type="dxa" w:w="6160"/>
+            <w:tcBorders>
+              <w:top w:val="single" w:color="CCCCCC" w:sz="1"/>
+              <w:left w:val="single" w:color="CCCCCC" w:sz="1"/>
+              <w:bottom w:val="single" w:color="CCCCCC" w:sz="1"/>
+              <w:right w:val="single" w:color="CCCCCC" w:sz="1"/>
+            </w:tcBorders>
+            <w:tcMar>
+              <w:top w:type="dxa" w:w="80"/>
+              <w:left w:type="dxa" w:w="120"/>
+              <w:bottom w:type="dxa" w:w="80"/>
+              <w:right w:type="dxa" w:w="120"/>
+            </w:tcMar>
+          </w:tcPr>
+          <w:p>
+            <w:r>
+              <w:rPr>
+                <w:rFonts w:ascii="Arial" w:cs="Arial" w:eastAsia="Arial" w:hAnsi="Arial"/>
+                <w:b w:val="false"/>
+                <w:bCs w:val="false"/>
+                <w:color w:val="333333"/>
+                <w:sz w:val="20"/>
+                <w:szCs w:val="20"/>
+              </w:rPr>
+              <w:t xml:space="preserve">Template: self-registration flow with org code validation and security tests.</w:t>
             </w:r>
           </w:p>
         </w:tc>
@@ -5655,7 +5935,7 @@
           <w:sz w:val="22"/>
           <w:szCs w:val="22"/>
         </w:rPr>
-        <w:t>Total: 24 files forming the complete, self-maintaining development harness for Reel48+.</w:t>
+        <w:t>Total: 27 files forming the complete, self-maintaining development harness for Reel48+.</w:t>
       </w:r>
     </w:p>
     <w:p>

</xml_diff>

<commit_message>
docs: sync companion guide and supporting docs with Carbon additions
Update companion guide to v2.5: add ADR-008 (IBM Carbon) to all
inventory tables, add carbon-design-system.md rule file to all
listings, update file count (27→30), ADR count (7→8), and frontend
CLAUDE.md description to mention Carbon. Fix harness-review prompt
ADR range (001-007→001-008).

Co-Authored-By: Claude Opus 4.6 <noreply@anthropic.com>
</commit_message>
<xml_diff>
--- a/Reel48+ Harness Companion Guide.docx
+++ b/Reel48+ Harness Companion Guide.docx
@@ -110,7 +110,7 @@
           <w:sz w:val="22"/>
           <w:szCs w:val="22"/>
         </w:rPr>
-        <w:t>April 2026 | v2.4 — Includes Harness Maintenance Protocol + Stripe Invoicing + Reel48 Admin Role + Self-Registration via Org Code</w:t>
+        <w:t>April 2026 | v2.5 — Includes Harness Maintenance Protocol + Stripe Invoicing + Reel48 Admin Role + Self-Registration via Org Code + IBM Carbon Design System</w:t>
       </w:r>
     </w:p>
     <w:p>
@@ -1084,7 +1084,7 @@
           <w:sz w:val="22"/>
           <w:szCs w:val="22"/>
         </w:rPr>
-        <w:t xml:space="preserve">Supplements the root CLAUDE.md with React, Next.js, and TypeScript conventions. Key sections cover Cognito/Amplify integration, component architecture (three categories with specific directories), App Router structure, state management (React Query + Context only, no Redux), API client, Tailwind rules, and testing approach.</w:t>
+        <w:t xml:space="preserve">Supplements the root CLAUDE.md with React, Next.js, and TypeScript conventions. Key sections cover Cognito/Amplify integration, IBM Carbon design system usage (component imports, styling boundaries, SCSS theming), component architecture (three categories with specific directories), App Router structure, state management (React Query + Context only, no Redux), API client, Carbon/Tailwind coexistence rules, and testing approach.</w:t>
       </w:r>
     </w:p>
     <w:p>
@@ -1941,6 +1941,38 @@
           </w:p>
         </w:tc>
       </w:tr>
+      <w:tr>
+        <w:tc>
+          <w:tcPr>
+            <w:tcW w:type="dxa" w:w="3000"/>
+          </w:tcPr>
+          <w:p>
+            <w:r>
+              <w:t>carbon-design-system.md</w:t>
+            </w:r>
+          </w:p>
+        </w:tc>
+        <w:tc>
+          <w:tcPr>
+            <w:tcW w:type="dxa" w:w="2500"/>
+          </w:tcPr>
+          <w:p>
+            <w:r>
+              <w:t>**/components/**, **/styles/**, **/*.scss, **/layout/**</w:t>
+            </w:r>
+          </w:p>
+        </w:tc>
+        <w:tc>
+          <w:tcPr>
+            <w:tcW w:type="dxa" w:w="3860"/>
+          </w:tcPr>
+          <w:p>
+            <w:r>
+              <w:t>IBM Carbon component selection, import patterns, styling boundaries (Carbon vs Tailwind), SCSS theming, CSS load order, tree-shaking</w:t>
+            </w:r>
+          </w:p>
+        </w:tc>
+      </w:tr>
     </w:tbl>
     <w:p>
       <w:pPr>
@@ -1965,7 +1997,7 @@
           <w:sz w:val="22"/>
           <w:szCs w:val="22"/>
         </w:rPr>
-        <w:t xml:space="preserve">Note the new harness-maintenance.md rule. This activates whenever Claude Code touches a harness file, ensuring maintenance protocols are followed even when editing the harness itself.</w:t>
+        <w:t xml:space="preserve">Note the harness-maintenance.md rule (activates when editing harness files) and the carbon-design-system.md rule (activates when editing component, styling, or layout files). Both ensure domain-specific conventions are followed automatically.</w:t>
       </w:r>
     </w:p>
     <w:p>
@@ -2454,6 +2486,28 @@
           </w:p>
         </w:tc>
       </w:tr>
+      <w:tr>
+        <w:tc>
+          <w:tcPr>
+            <w:tcW w:type="dxa" w:w="3200"/>
+          </w:tcPr>
+          <w:p>
+            <w:r>
+              <w:t>008: IBM Carbon Design System</w:t>
+            </w:r>
+          </w:p>
+        </w:tc>
+        <w:tc>
+          <w:tcPr>
+            <w:tcW w:type="dxa" w:w="6160"/>
+          </w:tcPr>
+          <w:p>
+            <w:r>
+              <w:t>IBM Carbon as primary design system with Tailwind as layout utility layer.</w:t>
+            </w:r>
+          </w:p>
+        </w:tc>
+      </w:tr>
     </w:tbl>
     <w:p>
       <w:pPr>
@@ -4006,6 +4060,28 @@
           </w:tcPr>
           <w:p>
             <w:r>
+              <w:t>docs/adr/008-ibm-carbon-design-system.md</w:t>
+            </w:r>
+          </w:p>
+        </w:tc>
+        <w:tc>
+          <w:tcPr>
+            <w:tcW w:type="dxa" w:w="6160"/>
+          </w:tcPr>
+          <w:p>
+            <w:r>
+              <w:t>ADR: IBM Carbon as primary design system with Tailwind as layout utility layer (ADR-008).</w:t>
+            </w:r>
+          </w:p>
+        </w:tc>
+      </w:tr>
+      <w:tr>
+        <w:tc>
+          <w:tcPr>
+            <w:tcW w:type="dxa" w:w="3200"/>
+          </w:tcPr>
+          <w:p>
+            <w:r>
               <w:t>prompts/self-registration.md</w:t>
             </w:r>
           </w:p>
@@ -5380,7 +5456,7 @@
                 <w:sz w:val="20"/>
                 <w:szCs w:val="20"/>
               </w:rPr>
-              <w:t xml:space="preserve">docs/adr/TEMPLATE.md</w:t>
+              <w:t xml:space="preserve">.claude/rules/carbon-design-system.md</w:t>
             </w:r>
           </w:p>
         </w:tc>
@@ -5410,7 +5486,7 @@
                 <w:sz w:val="20"/>
                 <w:szCs w:val="20"/>
               </w:rPr>
-              <w:t xml:space="preserve">Template for new Architectural Decision Records.</w:t>
+              <w:t xml:space="preserve">Rule: IBM Carbon component selection, import patterns, styling boundaries, SCSS theming, CSS load order.</w:t>
             </w:r>
           </w:p>
         </w:tc>
@@ -5442,7 +5518,7 @@
                 <w:sz w:val="20"/>
                 <w:szCs w:val="20"/>
               </w:rPr>
-              <w:t xml:space="preserve">docs/adr/001 through 007</w:t>
+              <w:t xml:space="preserve">docs/adr/TEMPLATE.md</w:t>
             </w:r>
           </w:p>
         </w:tc>
@@ -5472,7 +5548,7 @@
                 <w:sz w:val="20"/>
                 <w:szCs w:val="20"/>
               </w:rPr>
-              <w:t xml:space="preserve">Seven ADRs covering multi-tenancy, RLS, default sub-brand, REST, Cognito, Stripe invoicing, and self-registration.</w:t>
+              <w:t xml:space="preserve">Template for new Architectural Decision Records.</w:t>
             </w:r>
           </w:p>
         </w:tc>
@@ -5504,7 +5580,7 @@
                 <w:sz w:val="20"/>
                 <w:szCs w:val="20"/>
               </w:rPr>
-              <w:t xml:space="preserve">docs/harness-changelog.md</w:t>
+              <w:t xml:space="preserve">docs/adr/001 through 008</w:t>
             </w:r>
           </w:p>
         </w:tc>
@@ -5534,7 +5610,7 @@
                 <w:sz w:val="20"/>
                 <w:szCs w:val="20"/>
               </w:rPr>
-              <w:t xml:space="preserve">Chronological log of every harness change with metrics tracking.</w:t>
+              <w:t xml:space="preserve">Eight ADRs covering multi-tenancy, RLS, default sub-brand, REST, Cognito, Stripe invoicing, self-registration, and IBM Carbon design system.</w:t>
             </w:r>
           </w:p>
         </w:tc>
@@ -5566,7 +5642,7 @@
                 <w:sz w:val="20"/>
                 <w:szCs w:val="20"/>
               </w:rPr>
-              <w:t xml:space="preserve">prompts/crud-endpoint.md</w:t>
+              <w:t xml:space="preserve">docs/harness-changelog.md</w:t>
             </w:r>
           </w:p>
         </w:tc>
@@ -5596,7 +5672,7 @@
                 <w:sz w:val="20"/>
                 <w:szCs w:val="20"/>
               </w:rPr>
-              <w:t xml:space="preserve">Template: complete CRUD APIs with tenant isolation.</w:t>
+              <w:t xml:space="preserve">Chronological log of every harness change with metrics tracking.</w:t>
             </w:r>
           </w:p>
         </w:tc>
@@ -5628,7 +5704,7 @@
                 <w:sz w:val="20"/>
                 <w:szCs w:val="20"/>
               </w:rPr>
-              <w:t xml:space="preserve">prompts/new-table-migration.md</w:t>
+              <w:t xml:space="preserve">prompts/crud-endpoint.md</w:t>
             </w:r>
           </w:p>
         </w:tc>
@@ -5658,7 +5734,7 @@
                 <w:sz w:val="20"/>
                 <w:szCs w:val="20"/>
               </w:rPr>
-              <w:t xml:space="preserve">Template: database tables with RLS.</w:t>
+              <w:t xml:space="preserve">Template: complete CRUD APIs with tenant isolation.</w:t>
             </w:r>
           </w:p>
         </w:tc>
@@ -5690,7 +5766,7 @@
                 <w:sz w:val="20"/>
                 <w:szCs w:val="20"/>
               </w:rPr>
-              <w:t xml:space="preserve">prompts/react-component.md</w:t>
+              <w:t xml:space="preserve">prompts/new-table-migration.md</w:t>
             </w:r>
           </w:p>
         </w:tc>
@@ -5720,7 +5796,7 @@
                 <w:sz w:val="20"/>
                 <w:szCs w:val="20"/>
               </w:rPr>
-              <w:t xml:space="preserve">Template: React components with proper patterns.</w:t>
+              <w:t xml:space="preserve">Template: database tables with RLS.</w:t>
             </w:r>
           </w:p>
         </w:tc>
@@ -5752,7 +5828,7 @@
                 <w:sz w:val="20"/>
                 <w:szCs w:val="20"/>
               </w:rPr>
-              <w:t xml:space="preserve">prompts/test-suite.md</w:t>
+              <w:t xml:space="preserve">prompts/react-component.md</w:t>
             </w:r>
           </w:p>
         </w:tc>
@@ -5782,7 +5858,7 @@
                 <w:sz w:val="20"/>
                 <w:szCs w:val="20"/>
               </w:rPr>
-              <w:t xml:space="preserve">Template: comprehensive test suites with isolation tests.</w:t>
+              <w:t xml:space="preserve">Template: React components with proper patterns.</w:t>
             </w:r>
           </w:p>
         </w:tc>
@@ -5814,7 +5890,7 @@
                 <w:sz w:val="20"/>
                 <w:szCs w:val="20"/>
               </w:rPr>
-              <w:t xml:space="preserve">prompts/harness-review.md</w:t>
+              <w:t xml:space="preserve">prompts/test-suite.md</w:t>
             </w:r>
           </w:p>
         </w:tc>
@@ -5844,7 +5920,7 @@
                 <w:sz w:val="20"/>
                 <w:szCs w:val="20"/>
               </w:rPr>
-              <w:t xml:space="preserve">Template: post-module harness review process.</w:t>
+              <w:t xml:space="preserve">Template: comprehensive test suites with isolation tests.</w:t>
             </w:r>
           </w:p>
         </w:tc>
@@ -5876,6 +5952,68 @@
                 <w:sz w:val="20"/>
                 <w:szCs w:val="20"/>
               </w:rPr>
+              <w:t xml:space="preserve">prompts/harness-review.md</w:t>
+            </w:r>
+          </w:p>
+        </w:tc>
+        <w:tc>
+          <w:tcPr>
+            <w:tcW w:type="dxa" w:w="6160"/>
+            <w:tcBorders>
+              <w:top w:val="single" w:color="CCCCCC" w:sz="1"/>
+              <w:left w:val="single" w:color="CCCCCC" w:sz="1"/>
+              <w:bottom w:val="single" w:color="CCCCCC" w:sz="1"/>
+              <w:right w:val="single" w:color="CCCCCC" w:sz="1"/>
+            </w:tcBorders>
+            <w:tcMar>
+              <w:top w:type="dxa" w:w="80"/>
+              <w:left w:type="dxa" w:w="120"/>
+              <w:bottom w:type="dxa" w:w="80"/>
+              <w:right w:type="dxa" w:w="120"/>
+            </w:tcMar>
+          </w:tcPr>
+          <w:p>
+            <w:r>
+              <w:rPr>
+                <w:rFonts w:ascii="Arial" w:cs="Arial" w:eastAsia="Arial" w:hAnsi="Arial"/>
+                <w:b w:val="false"/>
+                <w:bCs w:val="false"/>
+                <w:color w:val="333333"/>
+                <w:sz w:val="20"/>
+                <w:szCs w:val="20"/>
+              </w:rPr>
+              <w:t xml:space="preserve">Template: post-module harness review process.</w:t>
+            </w:r>
+          </w:p>
+        </w:tc>
+      </w:tr>
+      <w:tr>
+        <w:tc>
+          <w:tcPr>
+            <w:tcW w:type="dxa" w:w="3200"/>
+            <w:tcBorders>
+              <w:top w:val="single" w:color="CCCCCC" w:sz="1"/>
+              <w:left w:val="single" w:color="CCCCCC" w:sz="1"/>
+              <w:bottom w:val="single" w:color="CCCCCC" w:sz="1"/>
+              <w:right w:val="single" w:color="CCCCCC" w:sz="1"/>
+            </w:tcBorders>
+            <w:tcMar>
+              <w:top w:type="dxa" w:w="80"/>
+              <w:left w:type="dxa" w:w="120"/>
+              <w:bottom w:type="dxa" w:w="80"/>
+              <w:right w:type="dxa" w:w="120"/>
+            </w:tcMar>
+          </w:tcPr>
+          <w:p>
+            <w:r>
+              <w:rPr>
+                <w:rFonts w:ascii="Arial" w:cs="Arial" w:eastAsia="Arial" w:hAnsi="Arial"/>
+                <w:b w:val="false"/>
+                <w:bCs w:val="false"/>
+                <w:color w:val="333333"/>
+                <w:sz w:val="20"/>
+                <w:szCs w:val="20"/>
+              </w:rPr>
               <w:t xml:space="preserve">prompts/self-registration.md</w:t>
             </w:r>
           </w:p>
@@ -5935,7 +6073,7 @@
           <w:sz w:val="22"/>
           <w:szCs w:val="22"/>
         </w:rPr>
-        <w:t>Total: 27 files forming the complete, self-maintaining development harness for Reel48+.</w:t>
+        <w:t>Total: 30 files forming the complete, self-maintaining development harness for Reel48+.</w:t>
       </w:r>
     </w:p>
     <w:p>

</xml_diff>